<commit_message>
Lab_03 and Lab_04 rebuilt
</commit_message>
<xml_diff>
--- a/Lab_03/Lab_03 Linuha.docx
+++ b/Lab_03/Lab_03 Linuha.docx
@@ -59,6 +59,7 @@
           <w:noProof/>
           <w:lang w:val="ru-RU" w:eastAsia="ru-RU"/>
         </w:rPr>
+        <w:lastRenderedPageBreak/>
         <w:drawing>
           <wp:inline distT="0" distB="0" distL="0" distR="0" wp14:anchorId="0165C932" wp14:editId="1A71CADD">
             <wp:extent cx="5274310" cy="4322856"/>
@@ -102,27 +103,16 @@
           </wp:inline>
         </w:drawing>
       </w:r>
-    </w:p>
-    <w:p>
-      <w:pPr>
+      <w:r>
         <w:rPr>
           <w:noProof/>
           <w:lang w:val="ru-RU" w:eastAsia="ru-RU"/>
         </w:rPr>
-      </w:pPr>
-    </w:p>
-    <w:p>
-      <w:r>
-        <w:rPr>
-          <w:noProof/>
-          <w:lang w:val="ru-RU" w:eastAsia="ru-RU"/>
-        </w:rPr>
-        <w:lastRenderedPageBreak/>
         <w:drawing>
-          <wp:inline distT="0" distB="0" distL="0" distR="0" wp14:anchorId="1A06B2C8" wp14:editId="18F61DFE">
-            <wp:extent cx="5274310" cy="4311883"/>
+          <wp:inline distT="0" distB="0" distL="0" distR="0" wp14:anchorId="79FC0C74" wp14:editId="77884E10">
+            <wp:extent cx="5274310" cy="3506470"/>
             <wp:effectExtent l="0" t="0" r="2540" b="0"/>
-            <wp:docPr id="6" name="Рисунок 6"/>
+            <wp:docPr id="7" name="Рисунок 7"/>
             <wp:cNvGraphicFramePr>
               <a:graphicFrameLocks xmlns:a="http://schemas.openxmlformats.org/drawingml/2006/main" noChangeAspect="1"/>
             </wp:cNvGraphicFramePr>
@@ -133,27 +123,20 @@
                     <pic:cNvPr id="1" name=""/>
                     <pic:cNvPicPr/>
                   </pic:nvPicPr>
-                  <pic:blipFill rotWithShape="1">
+                  <pic:blipFill>
                     <a:blip r:embed="rId7"/>
-                    <a:srcRect t="3533"/>
-                    <a:stretch/>
+                    <a:stretch>
+                      <a:fillRect/>
+                    </a:stretch>
                   </pic:blipFill>
-                  <pic:spPr bwMode="auto">
+                  <pic:spPr>
                     <a:xfrm>
                       <a:off x="0" y="0"/>
-                      <a:ext cx="5274310" cy="4311883"/>
+                      <a:ext cx="5274310" cy="3506470"/>
                     </a:xfrm>
                     <a:prstGeom prst="rect">
                       <a:avLst/>
                     </a:prstGeom>
-                    <a:ln>
-                      <a:noFill/>
-                    </a:ln>
-                    <a:extLst>
-                      <a:ext uri="{53640926-AAD7-44D8-BBD7-CCE9431645EC}">
-                        <a14:shadowObscured xmlns:a14="http://schemas.microsoft.com/office/drawing/2010/main"/>
-                      </a:ext>
-                    </a:extLst>
                   </pic:spPr>
                 </pic:pic>
               </a:graphicData>
@@ -163,16 +146,77 @@
       </w:r>
     </w:p>
     <w:p>
+      <w:pPr>
+        <w:rPr>
+          <w:lang w:val="ru-RU"/>
+        </w:rPr>
+      </w:pPr>
+    </w:p>
+    <w:p>
+      <w:pPr>
+        <w:rPr>
+          <w:lang w:val="ru-RU"/>
+        </w:rPr>
+      </w:pPr>
+    </w:p>
+    <w:p>
+      <w:pPr>
+        <w:rPr>
+          <w:lang w:val="ru-RU"/>
+        </w:rPr>
+      </w:pPr>
+    </w:p>
+    <w:p>
+      <w:pPr>
+        <w:rPr>
+          <w:lang w:val="ru-RU"/>
+        </w:rPr>
+      </w:pPr>
+    </w:p>
+    <w:p>
+      <w:pPr>
+        <w:rPr>
+          <w:lang w:val="ru-RU"/>
+        </w:rPr>
+      </w:pPr>
+    </w:p>
+    <w:p>
+      <w:pPr>
+        <w:rPr>
+          <w:lang w:val="ru-RU"/>
+        </w:rPr>
+      </w:pPr>
+    </w:p>
+    <w:p>
+      <w:pPr>
+        <w:rPr>
+          <w:lang w:val="ru-RU"/>
+        </w:rPr>
+      </w:pPr>
+      <w:r>
+        <w:rPr>
+          <w:lang w:val="ru-RU"/>
+        </w:rPr>
+        <w:lastRenderedPageBreak/>
+        <w:t>Задание 3:</w:t>
+      </w:r>
+    </w:p>
+    <w:p>
+      <w:pPr>
+        <w:rPr>
+          <w:lang w:val="ru-RU"/>
+        </w:rPr>
+      </w:pPr>
       <w:r>
         <w:rPr>
           <w:noProof/>
           <w:lang w:val="ru-RU" w:eastAsia="ru-RU"/>
         </w:rPr>
         <w:drawing>
-          <wp:inline distT="0" distB="0" distL="0" distR="0" wp14:anchorId="79FC0C74" wp14:editId="77884E10">
-            <wp:extent cx="5274310" cy="3506470"/>
-            <wp:effectExtent l="0" t="0" r="2540" b="0"/>
-            <wp:docPr id="7" name="Рисунок 7"/>
+          <wp:inline distT="0" distB="0" distL="0" distR="0" wp14:anchorId="5E69BAB6" wp14:editId="288DB8F7">
+            <wp:extent cx="5274310" cy="1767254"/>
+            <wp:effectExtent l="0" t="0" r="2540" b="4445"/>
+            <wp:docPr id="8" name="Рисунок 8"/>
             <wp:cNvGraphicFramePr>
               <a:graphicFrameLocks xmlns:a="http://schemas.openxmlformats.org/drawingml/2006/main" noChangeAspect="1"/>
             </wp:cNvGraphicFramePr>
@@ -192,7 +236,7 @@
                   <pic:spPr>
                     <a:xfrm>
                       <a:off x="0" y="0"/>
-                      <a:ext cx="5274310" cy="3506470"/>
+                      <a:ext cx="5276220" cy="1767894"/>
                     </a:xfrm>
                     <a:prstGeom prst="rect">
                       <a:avLst/>
@@ -211,72 +255,16 @@
           <w:lang w:val="ru-RU"/>
         </w:rPr>
       </w:pPr>
-    </w:p>
-    <w:p>
-      <w:pPr>
-        <w:rPr>
-          <w:lang w:val="ru-RU"/>
-        </w:rPr>
-      </w:pPr>
-    </w:p>
-    <w:p>
-      <w:pPr>
-        <w:rPr>
-          <w:lang w:val="ru-RU"/>
-        </w:rPr>
-      </w:pPr>
-    </w:p>
-    <w:p>
-      <w:pPr>
-        <w:rPr>
-          <w:lang w:val="ru-RU"/>
-        </w:rPr>
-      </w:pPr>
-    </w:p>
-    <w:p>
-      <w:pPr>
-        <w:rPr>
-          <w:lang w:val="ru-RU"/>
-        </w:rPr>
-      </w:pPr>
-    </w:p>
-    <w:p>
-      <w:pPr>
-        <w:rPr>
-          <w:lang w:val="ru-RU"/>
-        </w:rPr>
-      </w:pPr>
-    </w:p>
-    <w:p>
-      <w:pPr>
-        <w:rPr>
-          <w:lang w:val="ru-RU"/>
-        </w:rPr>
-      </w:pPr>
-      <w:r>
-        <w:rPr>
-          <w:lang w:val="ru-RU"/>
-        </w:rPr>
-        <w:lastRenderedPageBreak/>
-        <w:t>Задание 3:</w:t>
-      </w:r>
-    </w:p>
-    <w:p>
-      <w:pPr>
-        <w:rPr>
-          <w:lang w:val="ru-RU"/>
-        </w:rPr>
-      </w:pPr>
       <w:r>
         <w:rPr>
           <w:noProof/>
           <w:lang w:val="ru-RU" w:eastAsia="ru-RU"/>
         </w:rPr>
         <w:drawing>
-          <wp:inline distT="0" distB="0" distL="0" distR="0" wp14:anchorId="5E69BAB6" wp14:editId="288DB8F7">
-            <wp:extent cx="5274310" cy="1767254"/>
-            <wp:effectExtent l="0" t="0" r="2540" b="4445"/>
-            <wp:docPr id="8" name="Рисунок 8"/>
+          <wp:inline distT="0" distB="0" distL="0" distR="0" wp14:anchorId="4D593F0C" wp14:editId="591B5DA6">
+            <wp:extent cx="5274310" cy="899160"/>
+            <wp:effectExtent l="0" t="0" r="2540" b="0"/>
+            <wp:docPr id="9" name="Рисунок 9"/>
             <wp:cNvGraphicFramePr>
               <a:graphicFrameLocks xmlns:a="http://schemas.openxmlformats.org/drawingml/2006/main" noChangeAspect="1"/>
             </wp:cNvGraphicFramePr>
@@ -296,7 +284,7 @@
                   <pic:spPr>
                     <a:xfrm>
                       <a:off x="0" y="0"/>
-                      <a:ext cx="5276220" cy="1767894"/>
+                      <a:ext cx="5274310" cy="899160"/>
                     </a:xfrm>
                     <a:prstGeom prst="rect">
                       <a:avLst/>
@@ -321,10 +309,10 @@
           <w:lang w:val="ru-RU" w:eastAsia="ru-RU"/>
         </w:rPr>
         <w:drawing>
-          <wp:inline distT="0" distB="0" distL="0" distR="0" wp14:anchorId="4D593F0C" wp14:editId="591B5DA6">
-            <wp:extent cx="5274310" cy="899160"/>
-            <wp:effectExtent l="0" t="0" r="2540" b="0"/>
-            <wp:docPr id="9" name="Рисунок 9"/>
+          <wp:inline distT="0" distB="0" distL="0" distR="0" wp14:anchorId="03CF60C2" wp14:editId="1A542984">
+            <wp:extent cx="5274310" cy="1236345"/>
+            <wp:effectExtent l="0" t="0" r="2540" b="1905"/>
+            <wp:docPr id="10" name="Рисунок 10"/>
             <wp:cNvGraphicFramePr>
               <a:graphicFrameLocks xmlns:a="http://schemas.openxmlformats.org/drawingml/2006/main" noChangeAspect="1"/>
             </wp:cNvGraphicFramePr>
@@ -344,54 +332,6 @@
                   <pic:spPr>
                     <a:xfrm>
                       <a:off x="0" y="0"/>
-                      <a:ext cx="5274310" cy="899160"/>
-                    </a:xfrm>
-                    <a:prstGeom prst="rect">
-                      <a:avLst/>
-                    </a:prstGeom>
-                  </pic:spPr>
-                </pic:pic>
-              </a:graphicData>
-            </a:graphic>
-          </wp:inline>
-        </w:drawing>
-      </w:r>
-    </w:p>
-    <w:p>
-      <w:pPr>
-        <w:rPr>
-          <w:lang w:val="ru-RU"/>
-        </w:rPr>
-      </w:pPr>
-      <w:r>
-        <w:rPr>
-          <w:noProof/>
-          <w:lang w:val="ru-RU" w:eastAsia="ru-RU"/>
-        </w:rPr>
-        <w:drawing>
-          <wp:inline distT="0" distB="0" distL="0" distR="0" wp14:anchorId="03CF60C2" wp14:editId="1A542984">
-            <wp:extent cx="5274310" cy="1236345"/>
-            <wp:effectExtent l="0" t="0" r="2540" b="1905"/>
-            <wp:docPr id="10" name="Рисунок 10"/>
-            <wp:cNvGraphicFramePr>
-              <a:graphicFrameLocks xmlns:a="http://schemas.openxmlformats.org/drawingml/2006/main" noChangeAspect="1"/>
-            </wp:cNvGraphicFramePr>
-            <a:graphic xmlns:a="http://schemas.openxmlformats.org/drawingml/2006/main">
-              <a:graphicData uri="http://schemas.openxmlformats.org/drawingml/2006/picture">
-                <pic:pic xmlns:pic="http://schemas.openxmlformats.org/drawingml/2006/picture">
-                  <pic:nvPicPr>
-                    <pic:cNvPr id="1" name=""/>
-                    <pic:cNvPicPr/>
-                  </pic:nvPicPr>
-                  <pic:blipFill>
-                    <a:blip r:embed="rId11"/>
-                    <a:stretch>
-                      <a:fillRect/>
-                    </a:stretch>
-                  </pic:blipFill>
-                  <pic:spPr>
-                    <a:xfrm>
-                      <a:off x="0" y="0"/>
                       <a:ext cx="5274310" cy="1236345"/>
                     </a:xfrm>
                     <a:prstGeom prst="rect">
@@ -432,7 +372,7 @@
                     <pic:cNvPicPr/>
                   </pic:nvPicPr>
                   <pic:blipFill rotWithShape="1">
-                    <a:blip r:embed="rId12"/>
+                    <a:blip r:embed="rId11"/>
                     <a:srcRect b="22636"/>
                     <a:stretch/>
                   </pic:blipFill>
@@ -487,7 +427,7 @@
                     <pic:cNvPicPr/>
                   </pic:nvPicPr>
                   <pic:blipFill>
-                    <a:blip r:embed="rId13"/>
+                    <a:blip r:embed="rId12"/>
                     <a:stretch>
                       <a:fillRect/>
                     </a:stretch>
@@ -531,6 +471,54 @@
             <wp:extent cx="5274310" cy="901065"/>
             <wp:effectExtent l="0" t="0" r="2540" b="0"/>
             <wp:docPr id="13" name="Рисунок 13"/>
+            <wp:cNvGraphicFramePr>
+              <a:graphicFrameLocks xmlns:a="http://schemas.openxmlformats.org/drawingml/2006/main" noChangeAspect="1"/>
+            </wp:cNvGraphicFramePr>
+            <a:graphic xmlns:a="http://schemas.openxmlformats.org/drawingml/2006/main">
+              <a:graphicData uri="http://schemas.openxmlformats.org/drawingml/2006/picture">
+                <pic:pic xmlns:pic="http://schemas.openxmlformats.org/drawingml/2006/picture">
+                  <pic:nvPicPr>
+                    <pic:cNvPr id="1" name=""/>
+                    <pic:cNvPicPr/>
+                  </pic:nvPicPr>
+                  <pic:blipFill>
+                    <a:blip r:embed="rId13"/>
+                    <a:stretch>
+                      <a:fillRect/>
+                    </a:stretch>
+                  </pic:blipFill>
+                  <pic:spPr>
+                    <a:xfrm>
+                      <a:off x="0" y="0"/>
+                      <a:ext cx="5274310" cy="901065"/>
+                    </a:xfrm>
+                    <a:prstGeom prst="rect">
+                      <a:avLst/>
+                    </a:prstGeom>
+                  </pic:spPr>
+                </pic:pic>
+              </a:graphicData>
+            </a:graphic>
+          </wp:inline>
+        </w:drawing>
+      </w:r>
+    </w:p>
+    <w:p>
+      <w:pPr>
+        <w:rPr>
+          <w:lang w:val="ru-RU"/>
+        </w:rPr>
+      </w:pPr>
+      <w:r>
+        <w:rPr>
+          <w:noProof/>
+          <w:lang w:val="ru-RU" w:eastAsia="ru-RU"/>
+        </w:rPr>
+        <w:drawing>
+          <wp:inline distT="0" distB="0" distL="0" distR="0" wp14:anchorId="60B93987" wp14:editId="2525D3CD">
+            <wp:extent cx="5274310" cy="154305"/>
+            <wp:effectExtent l="0" t="0" r="2540" b="0"/>
+            <wp:docPr id="14" name="Рисунок 14"/>
             <wp:cNvGraphicFramePr>
               <a:graphicFrameLocks xmlns:a="http://schemas.openxmlformats.org/drawingml/2006/main" noChangeAspect="1"/>
             </wp:cNvGraphicFramePr>
@@ -550,7 +538,7 @@
                   <pic:spPr>
                     <a:xfrm>
                       <a:off x="0" y="0"/>
-                      <a:ext cx="5274310" cy="901065"/>
+                      <a:ext cx="5274310" cy="154305"/>
                     </a:xfrm>
                     <a:prstGeom prst="rect">
                       <a:avLst/>
@@ -569,16 +557,18 @@
           <w:lang w:val="ru-RU"/>
         </w:rPr>
       </w:pPr>
+    </w:p>
+    <w:p>
       <w:r>
         <w:rPr>
           <w:noProof/>
           <w:lang w:val="ru-RU" w:eastAsia="ru-RU"/>
         </w:rPr>
         <w:drawing>
-          <wp:inline distT="0" distB="0" distL="0" distR="0" wp14:anchorId="60B93987" wp14:editId="2525D3CD">
-            <wp:extent cx="5274310" cy="154305"/>
+          <wp:inline distT="0" distB="0" distL="0" distR="0" wp14:anchorId="57E2961B" wp14:editId="60FA6E9B">
+            <wp:extent cx="5274310" cy="1314450"/>
             <wp:effectExtent l="0" t="0" r="2540" b="0"/>
-            <wp:docPr id="14" name="Рисунок 14"/>
+            <wp:docPr id="15" name="Рисунок 15"/>
             <wp:cNvGraphicFramePr>
               <a:graphicFrameLocks xmlns:a="http://schemas.openxmlformats.org/drawingml/2006/main" noChangeAspect="1"/>
             </wp:cNvGraphicFramePr>
@@ -598,7 +588,7 @@
                   <pic:spPr>
                     <a:xfrm>
                       <a:off x="0" y="0"/>
-                      <a:ext cx="5274310" cy="154305"/>
+                      <a:ext cx="5274310" cy="1314450"/>
                     </a:xfrm>
                     <a:prstGeom prst="rect">
                       <a:avLst/>
@@ -612,23 +602,16 @@
       </w:r>
     </w:p>
     <w:p>
-      <w:pPr>
-        <w:rPr>
-          <w:lang w:val="ru-RU"/>
-        </w:rPr>
-      </w:pPr>
-    </w:p>
-    <w:p>
       <w:r>
         <w:rPr>
           <w:noProof/>
           <w:lang w:val="ru-RU" w:eastAsia="ru-RU"/>
         </w:rPr>
         <w:drawing>
-          <wp:inline distT="0" distB="0" distL="0" distR="0" wp14:anchorId="57E2961B" wp14:editId="60FA6E9B">
-            <wp:extent cx="5274310" cy="1314450"/>
-            <wp:effectExtent l="0" t="0" r="2540" b="0"/>
-            <wp:docPr id="15" name="Рисунок 15"/>
+          <wp:inline distT="0" distB="0" distL="0" distR="0" wp14:anchorId="35C6BD88" wp14:editId="3C1B7B6E">
+            <wp:extent cx="5274310" cy="1363345"/>
+            <wp:effectExtent l="0" t="0" r="2540" b="8255"/>
+            <wp:docPr id="16" name="Рисунок 16"/>
             <wp:cNvGraphicFramePr>
               <a:graphicFrameLocks xmlns:a="http://schemas.openxmlformats.org/drawingml/2006/main" noChangeAspect="1"/>
             </wp:cNvGraphicFramePr>
@@ -648,7 +631,7 @@
                   <pic:spPr>
                     <a:xfrm>
                       <a:off x="0" y="0"/>
-                      <a:ext cx="5274310" cy="1314450"/>
+                      <a:ext cx="5274310" cy="1363345"/>
                     </a:xfrm>
                     <a:prstGeom prst="rect">
                       <a:avLst/>
@@ -667,11 +650,12 @@
           <w:noProof/>
           <w:lang w:val="ru-RU" w:eastAsia="ru-RU"/>
         </w:rPr>
+        <w:lastRenderedPageBreak/>
         <w:drawing>
-          <wp:inline distT="0" distB="0" distL="0" distR="0" wp14:anchorId="35C6BD88" wp14:editId="3C1B7B6E">
-            <wp:extent cx="5274310" cy="1363345"/>
-            <wp:effectExtent l="0" t="0" r="2540" b="8255"/>
-            <wp:docPr id="16" name="Рисунок 16"/>
+          <wp:inline distT="0" distB="0" distL="0" distR="0" wp14:anchorId="3E0665B9" wp14:editId="1B9C3E74">
+            <wp:extent cx="5274310" cy="1717675"/>
+            <wp:effectExtent l="0" t="0" r="2540" b="0"/>
+            <wp:docPr id="17" name="Рисунок 17"/>
             <wp:cNvGraphicFramePr>
               <a:graphicFrameLocks xmlns:a="http://schemas.openxmlformats.org/drawingml/2006/main" noChangeAspect="1"/>
             </wp:cNvGraphicFramePr>
@@ -691,7 +675,7 @@
                   <pic:spPr>
                     <a:xfrm>
                       <a:off x="0" y="0"/>
-                      <a:ext cx="5274310" cy="1363345"/>
+                      <a:ext cx="5274310" cy="1717675"/>
                     </a:xfrm>
                     <a:prstGeom prst="rect">
                       <a:avLst/>
@@ -710,12 +694,11 @@
           <w:noProof/>
           <w:lang w:val="ru-RU" w:eastAsia="ru-RU"/>
         </w:rPr>
-        <w:lastRenderedPageBreak/>
         <w:drawing>
-          <wp:inline distT="0" distB="0" distL="0" distR="0" wp14:anchorId="3E0665B9" wp14:editId="1B9C3E74">
-            <wp:extent cx="5274310" cy="1717675"/>
+          <wp:inline distT="0" distB="0" distL="0" distR="0" wp14:anchorId="562175C7" wp14:editId="09D683FF">
+            <wp:extent cx="5274310" cy="2193290"/>
             <wp:effectExtent l="0" t="0" r="2540" b="0"/>
-            <wp:docPr id="17" name="Рисунок 17"/>
+            <wp:docPr id="18" name="Рисунок 18"/>
             <wp:cNvGraphicFramePr>
               <a:graphicFrameLocks xmlns:a="http://schemas.openxmlformats.org/drawingml/2006/main" noChangeAspect="1"/>
             </wp:cNvGraphicFramePr>
@@ -735,7 +718,7 @@
                   <pic:spPr>
                     <a:xfrm>
                       <a:off x="0" y="0"/>
-                      <a:ext cx="5274310" cy="1717675"/>
+                      <a:ext cx="5274310" cy="2193290"/>
                     </a:xfrm>
                     <a:prstGeom prst="rect">
                       <a:avLst/>
@@ -755,10 +738,10 @@
           <w:lang w:val="ru-RU" w:eastAsia="ru-RU"/>
         </w:rPr>
         <w:drawing>
-          <wp:inline distT="0" distB="0" distL="0" distR="0" wp14:anchorId="562175C7" wp14:editId="09D683FF">
-            <wp:extent cx="5274310" cy="2193290"/>
-            <wp:effectExtent l="0" t="0" r="2540" b="0"/>
-            <wp:docPr id="18" name="Рисунок 18"/>
+          <wp:inline distT="0" distB="0" distL="0" distR="0" wp14:anchorId="5801EBEF" wp14:editId="4C74AFCF">
+            <wp:extent cx="5274310" cy="2890520"/>
+            <wp:effectExtent l="0" t="0" r="2540" b="5080"/>
+            <wp:docPr id="19" name="Рисунок 19"/>
             <wp:cNvGraphicFramePr>
               <a:graphicFrameLocks xmlns:a="http://schemas.openxmlformats.org/drawingml/2006/main" noChangeAspect="1"/>
             </wp:cNvGraphicFramePr>
@@ -778,7 +761,7 @@
                   <pic:spPr>
                     <a:xfrm>
                       <a:off x="0" y="0"/>
-                      <a:ext cx="5274310" cy="2193290"/>
+                      <a:ext cx="5274310" cy="2890520"/>
                     </a:xfrm>
                     <a:prstGeom prst="rect">
                       <a:avLst/>
@@ -797,11 +780,12 @@
           <w:noProof/>
           <w:lang w:val="ru-RU" w:eastAsia="ru-RU"/>
         </w:rPr>
+        <w:lastRenderedPageBreak/>
         <w:drawing>
-          <wp:inline distT="0" distB="0" distL="0" distR="0" wp14:anchorId="5801EBEF" wp14:editId="4C74AFCF">
-            <wp:extent cx="5274310" cy="2890520"/>
-            <wp:effectExtent l="0" t="0" r="2540" b="5080"/>
-            <wp:docPr id="19" name="Рисунок 19"/>
+          <wp:inline distT="0" distB="0" distL="0" distR="0" wp14:anchorId="3C384DF2" wp14:editId="2B875D01">
+            <wp:extent cx="5274310" cy="2127250"/>
+            <wp:effectExtent l="0" t="0" r="2540" b="6350"/>
+            <wp:docPr id="20" name="Рисунок 20"/>
             <wp:cNvGraphicFramePr>
               <a:graphicFrameLocks xmlns:a="http://schemas.openxmlformats.org/drawingml/2006/main" noChangeAspect="1"/>
             </wp:cNvGraphicFramePr>
@@ -821,7 +805,7 @@
                   <pic:spPr>
                     <a:xfrm>
                       <a:off x="0" y="0"/>
-                      <a:ext cx="5274310" cy="2890520"/>
+                      <a:ext cx="5274310" cy="2127250"/>
                     </a:xfrm>
                     <a:prstGeom prst="rect">
                       <a:avLst/>
@@ -840,12 +824,11 @@
           <w:noProof/>
           <w:lang w:val="ru-RU" w:eastAsia="ru-RU"/>
         </w:rPr>
-        <w:lastRenderedPageBreak/>
         <w:drawing>
-          <wp:inline distT="0" distB="0" distL="0" distR="0" wp14:anchorId="3C384DF2" wp14:editId="2B875D01">
-            <wp:extent cx="5274310" cy="2127250"/>
-            <wp:effectExtent l="0" t="0" r="2540" b="6350"/>
-            <wp:docPr id="20" name="Рисунок 20"/>
+          <wp:inline distT="0" distB="0" distL="0" distR="0" wp14:anchorId="2900E89F" wp14:editId="20F9D854">
+            <wp:extent cx="5274310" cy="2034540"/>
+            <wp:effectExtent l="0" t="0" r="2540" b="3810"/>
+            <wp:docPr id="21" name="Рисунок 21"/>
             <wp:cNvGraphicFramePr>
               <a:graphicFrameLocks xmlns:a="http://schemas.openxmlformats.org/drawingml/2006/main" noChangeAspect="1"/>
             </wp:cNvGraphicFramePr>
@@ -865,7 +848,7 @@
                   <pic:spPr>
                     <a:xfrm>
                       <a:off x="0" y="0"/>
-                      <a:ext cx="5274310" cy="2127250"/>
+                      <a:ext cx="5274310" cy="2034540"/>
                     </a:xfrm>
                     <a:prstGeom prst="rect">
                       <a:avLst/>
@@ -885,10 +868,10 @@
           <w:lang w:val="ru-RU" w:eastAsia="ru-RU"/>
         </w:rPr>
         <w:drawing>
-          <wp:inline distT="0" distB="0" distL="0" distR="0" wp14:anchorId="2900E89F" wp14:editId="20F9D854">
-            <wp:extent cx="5274310" cy="2034540"/>
-            <wp:effectExtent l="0" t="0" r="2540" b="3810"/>
-            <wp:docPr id="21" name="Рисунок 21"/>
+          <wp:inline distT="0" distB="0" distL="0" distR="0" wp14:anchorId="6CE5BC1A" wp14:editId="10B22D8F">
+            <wp:extent cx="5274310" cy="1907540"/>
+            <wp:effectExtent l="0" t="0" r="2540" b="0"/>
+            <wp:docPr id="22" name="Рисунок 22"/>
             <wp:cNvGraphicFramePr>
               <a:graphicFrameLocks xmlns:a="http://schemas.openxmlformats.org/drawingml/2006/main" noChangeAspect="1"/>
             </wp:cNvGraphicFramePr>
@@ -908,7 +891,7 @@
                   <pic:spPr>
                     <a:xfrm>
                       <a:off x="0" y="0"/>
-                      <a:ext cx="5274310" cy="2034540"/>
+                      <a:ext cx="5274310" cy="1907540"/>
                     </a:xfrm>
                     <a:prstGeom prst="rect">
                       <a:avLst/>
@@ -928,10 +911,10 @@
           <w:lang w:val="ru-RU" w:eastAsia="ru-RU"/>
         </w:rPr>
         <w:drawing>
-          <wp:inline distT="0" distB="0" distL="0" distR="0" wp14:anchorId="6CE5BC1A" wp14:editId="10B22D8F">
-            <wp:extent cx="5274310" cy="1907540"/>
+          <wp:inline distT="0" distB="0" distL="0" distR="0" wp14:anchorId="4A668968" wp14:editId="18945983">
+            <wp:extent cx="5274310" cy="2096135"/>
             <wp:effectExtent l="0" t="0" r="2540" b="0"/>
-            <wp:docPr id="22" name="Рисунок 22"/>
+            <wp:docPr id="23" name="Рисунок 23"/>
             <wp:cNvGraphicFramePr>
               <a:graphicFrameLocks xmlns:a="http://schemas.openxmlformats.org/drawingml/2006/main" noChangeAspect="1"/>
             </wp:cNvGraphicFramePr>
@@ -951,49 +934,6 @@
                   <pic:spPr>
                     <a:xfrm>
                       <a:off x="0" y="0"/>
-                      <a:ext cx="5274310" cy="1907540"/>
-                    </a:xfrm>
-                    <a:prstGeom prst="rect">
-                      <a:avLst/>
-                    </a:prstGeom>
-                  </pic:spPr>
-                </pic:pic>
-              </a:graphicData>
-            </a:graphic>
-          </wp:inline>
-        </w:drawing>
-      </w:r>
-    </w:p>
-    <w:p>
-      <w:r>
-        <w:rPr>
-          <w:noProof/>
-          <w:lang w:val="ru-RU" w:eastAsia="ru-RU"/>
-        </w:rPr>
-        <w:drawing>
-          <wp:inline distT="0" distB="0" distL="0" distR="0" wp14:anchorId="4A668968" wp14:editId="18945983">
-            <wp:extent cx="5274310" cy="2096135"/>
-            <wp:effectExtent l="0" t="0" r="2540" b="0"/>
-            <wp:docPr id="23" name="Рисунок 23"/>
-            <wp:cNvGraphicFramePr>
-              <a:graphicFrameLocks xmlns:a="http://schemas.openxmlformats.org/drawingml/2006/main" noChangeAspect="1"/>
-            </wp:cNvGraphicFramePr>
-            <a:graphic xmlns:a="http://schemas.openxmlformats.org/drawingml/2006/main">
-              <a:graphicData uri="http://schemas.openxmlformats.org/drawingml/2006/picture">
-                <pic:pic xmlns:pic="http://schemas.openxmlformats.org/drawingml/2006/picture">
-                  <pic:nvPicPr>
-                    <pic:cNvPr id="1" name=""/>
-                    <pic:cNvPicPr/>
-                  </pic:nvPicPr>
-                  <pic:blipFill>
-                    <a:blip r:embed="rId24"/>
-                    <a:stretch>
-                      <a:fillRect/>
-                    </a:stretch>
-                  </pic:blipFill>
-                  <pic:spPr>
-                    <a:xfrm>
-                      <a:off x="0" y="0"/>
                       <a:ext cx="5274310" cy="2096135"/>
                     </a:xfrm>
                     <a:prstGeom prst="rect">
@@ -1030,7 +970,7 @@
                     <pic:cNvPicPr/>
                   </pic:nvPicPr>
                   <pic:blipFill>
-                    <a:blip r:embed="rId25"/>
+                    <a:blip r:embed="rId24"/>
                     <a:stretch>
                       <a:fillRect/>
                     </a:stretch>

</xml_diff>